<commit_message>
fix: update web publishing script and today plan start button reachability test
</commit_message>
<xml_diff>
--- a/doc/小米-人工智能生成合成内容标识材料-泡泡单词.docx
+++ b/doc/小米-人工智能生成合成内容标识材料-泡泡单词.docx
@@ -554,53 +554,78 @@
         <w:jc w:val="left"/>
       </w:pPr>
       <w:r>
-        <w:rPr>
-          <w:rFonts w:ascii="Arial" w:hAnsi="Arial" w:eastAsia="等线" w:cs="Arial"/>
-          <w:sz w:val="22"/>
-        </w:rPr>
-        <w:t>【此处插入显式标识位置示例图】</w:t>
-      </w:r>
-    </w:p>
-    <w:p>
-      <w:pPr>
-        <w:spacing w:before="120" w:after="120" w:line="288" w:lineRule="auto"/>
-        <w:ind w:left="453"/>
-        <w:jc w:val="left"/>
-      </w:pPr>
-      <w:r>
-        <w:rPr>
-          <w:rFonts w:ascii="Arial" w:hAnsi="Arial" w:eastAsia="等线" w:cs="Arial"/>
-          <w:sz w:val="22"/>
-        </w:rPr>
-        <w:t>图1：AI 单词小短文页面 —— 内容区起始位置显示「AI生成」。</w:t>
-      </w:r>
-    </w:p>
-    <w:p>
-      <w:pPr>
-        <w:spacing w:before="120" w:after="120" w:line="288" w:lineRule="auto"/>
-        <w:ind w:left="453"/>
-        <w:jc w:val="left"/>
-      </w:pPr>
-      <w:r>
-        <w:rPr>
-          <w:rFonts w:ascii="Arial" w:hAnsi="Arial" w:eastAsia="等线" w:cs="Arial"/>
-          <w:sz w:val="22"/>
-        </w:rPr>
-        <w:t>图2：AI 助教回答 —— 回答内容上方显示「AI生成」。</w:t>
-      </w:r>
-    </w:p>
-    <w:p>
-      <w:pPr>
-        <w:spacing w:before="120" w:after="120" w:line="288" w:lineRule="auto"/>
-        <w:ind w:left="453"/>
-        <w:jc w:val="left"/>
-      </w:pPr>
-      <w:r>
-        <w:rPr>
-          <w:rFonts w:ascii="Arial" w:hAnsi="Arial" w:eastAsia="等线" w:cs="Arial"/>
-          <w:sz w:val="22"/>
-        </w:rPr>
-        <w:t>图3：点击「复制全文」后粘贴出的文本 —— 首行显示「AI生成」。</w:t>
+        <w:drawing>
+          <wp:inline xmlns:a="http://schemas.openxmlformats.org/drawingml/2006/main" xmlns:pic="http://schemas.openxmlformats.org/drawingml/2006/picture">
+            <wp:extent cx="4320000" cy="5280000"/>
+            <wp:docPr id="1" name="Picture 1"/>
+            <wp:cNvGraphicFramePr>
+              <a:graphicFrameLocks noChangeAspect="1"/>
+            </wp:cNvGraphicFramePr>
+            <a:graphic>
+              <a:graphicData uri="http://schemas.openxmlformats.org/drawingml/2006/picture">
+                <pic:pic>
+                  <pic:nvPicPr>
+                    <pic:cNvPr id="0" name="fig-explicit-ai-tutor.png"/>
+                    <pic:cNvPicPr/>
+                  </pic:nvPicPr>
+                  <pic:blipFill>
+                    <a:blip r:embed="rId8"/>
+                    <a:stretch>
+                      <a:fillRect/>
+                    </a:stretch>
+                  </pic:blipFill>
+                  <pic:spPr>
+                    <a:xfrm>
+                      <a:off x="0" y="0"/>
+                      <a:ext cx="4320000" cy="5280000"/>
+                    </a:xfrm>
+                    <a:prstGeom prst="rect"/>
+                  </pic:spPr>
+                </pic:pic>
+              </a:graphicData>
+            </a:graphic>
+          </wp:inline>
+        </w:drawing>
+      </w:r>
+    </w:p>
+    <w:p>
+      <w:pPr>
+        <w:spacing w:before="120" w:after="120" w:line="288" w:lineRule="auto"/>
+        <w:ind w:left="453"/>
+        <w:jc w:val="left"/>
+      </w:pPr>
+      <w:r>
+        <w:rPr>
+          <w:rFonts w:ascii="Arial" w:hAnsi="Arial" w:eastAsia="等线" w:cs="Arial"/>
+          <w:sz w:val="22"/>
+        </w:rPr>
+        <w:t>图1：AI 助教回答 —— 回答内容上方显示「AI生成」（AI 单词小短文页使用同一种「AI生成」提示文字）。</w:t>
+      </w:r>
+    </w:p>
+    <w:p>
+      <w:pPr>
+        <w:spacing w:before="120" w:after="120" w:line="288" w:lineRule="auto"/>
+        <w:ind w:left="453"/>
+        <w:jc w:val="left"/>
+      </w:pPr>
+      <w:r>
+        <w:rPr>
+          <w:rFonts w:ascii="Arial" w:hAnsi="Arial" w:eastAsia="等线" w:cs="Arial"/>
+          <w:sz w:val="22"/>
+        </w:rPr>
+      </w:r>
+    </w:p>
+    <w:p>
+      <w:pPr>
+        <w:spacing w:before="120" w:after="120" w:line="288" w:lineRule="auto"/>
+        <w:ind w:left="453"/>
+        <w:jc w:val="left"/>
+      </w:pPr>
+      <w:r>
+        <w:rPr>
+          <w:rFonts w:ascii="Arial" w:hAnsi="Arial" w:eastAsia="等线" w:cs="Arial"/>
+          <w:sz w:val="22"/>
+        </w:rPr>
       </w:r>
     </w:p>
     <w:p>
@@ -802,21 +827,20 @@
           <w:rFonts w:ascii="Arial" w:hAnsi="Arial" w:eastAsia="等线" w:cs="Arial"/>
           <w:sz w:val="22"/>
         </w:rPr>
-        <w:t>【此处插入隐式标识内容截图】</w:t>
-      </w:r>
-    </w:p>
-    <w:p>
-      <w:pPr>
-        <w:spacing w:before="120" w:after="120" w:line="288" w:lineRule="auto"/>
-        <w:ind w:left="453"/>
-        <w:jc w:val="left"/>
-      </w:pPr>
-      <w:r>
-        <w:rPr>
-          <w:rFonts w:ascii="Arial" w:hAnsi="Arial" w:eastAsia="等线" w:cs="Arial"/>
-          <w:sz w:val="22"/>
-        </w:rPr>
-        <w:t>图4：点击「复制全文」后将内容粘贴至便签的截图 —— 首行显示「AI生成」。</w:t>
+        <w:t>本应用不向用户提供生成合成内容的文件下载或导出功能，不产生图片、音频、视频文件元数据隐式标识，故无隐式标识内容截图。</w:t>
+      </w:r>
+    </w:p>
+    <w:p>
+      <w:pPr>
+        <w:spacing w:before="120" w:after="120" w:line="288" w:lineRule="auto"/>
+        <w:ind w:left="453"/>
+        <w:jc w:val="left"/>
+      </w:pPr>
+      <w:r>
+        <w:rPr>
+          <w:rFonts w:ascii="Arial" w:hAnsi="Arial" w:eastAsia="等线" w:cs="Arial"/>
+          <w:sz w:val="22"/>
+        </w:rPr>
       </w:r>
     </w:p>
     <w:p>

</xml_diff>

<commit_message>
feat: remove ai_story_page.dart word list view
</commit_message>
<xml_diff>
--- a/doc/小米-人工智能生成合成内容标识材料-泡泡单词.docx
+++ b/doc/小米-人工智能生成合成内容标识材料-泡泡单词.docx
@@ -365,7 +365,7 @@
     <w:p>
       <w:pPr>
         <w:spacing w:before="120" w:after="120" w:line="288" w:lineRule="auto"/>
-        <w:ind w:left="453"/>
+        <w:ind w:left="0" w:firstLine="0"/>
         <w:jc w:val="left"/>
       </w:pPr>
       <w:r>
@@ -379,7 +379,7 @@
     <w:p>
       <w:pPr>
         <w:spacing w:before="120" w:after="120" w:line="288" w:lineRule="auto"/>
-        <w:ind w:left="453"/>
+        <w:ind w:left="0" w:firstLine="0"/>
         <w:jc w:val="left"/>
       </w:pPr>
       <w:r>
@@ -393,7 +393,7 @@
     <w:p>
       <w:pPr>
         <w:spacing w:before="120" w:after="120" w:line="288" w:lineRule="auto"/>
-        <w:ind w:left="453"/>
+        <w:ind w:left="0" w:firstLine="0"/>
         <w:jc w:val="left"/>
       </w:pPr>
       <w:r>
@@ -407,7 +407,7 @@
     <w:p>
       <w:pPr>
         <w:spacing w:before="120" w:after="120" w:line="288" w:lineRule="auto"/>
-        <w:ind w:left="453"/>
+        <w:ind w:left="0" w:firstLine="0"/>
         <w:jc w:val="left"/>
       </w:pPr>
       <w:r>
@@ -421,7 +421,7 @@
     <w:p>
       <w:pPr>
         <w:spacing w:before="120" w:after="120" w:line="288" w:lineRule="auto"/>
-        <w:ind w:left="453"/>
+        <w:ind w:left="0" w:firstLine="0"/>
         <w:jc w:val="left"/>
       </w:pPr>
       <w:r>
@@ -435,7 +435,7 @@
     <w:p>
       <w:pPr>
         <w:spacing w:before="120" w:after="120" w:line="288" w:lineRule="auto"/>
-        <w:ind w:left="453"/>
+        <w:ind w:left="0" w:firstLine="0"/>
         <w:jc w:val="left"/>
       </w:pPr>
       <w:r>
@@ -449,7 +449,7 @@
     <w:p>
       <w:pPr>
         <w:spacing w:before="120" w:after="120" w:line="288" w:lineRule="auto"/>
-        <w:ind w:left="453"/>
+        <w:ind w:left="0" w:firstLine="0"/>
         <w:jc w:val="left"/>
       </w:pPr>
       <w:r>
@@ -463,7 +463,7 @@
     <w:p>
       <w:pPr>
         <w:spacing w:before="120" w:after="120" w:line="288" w:lineRule="auto"/>
-        <w:ind w:left="453"/>
+        <w:ind w:left="0" w:firstLine="0"/>
         <w:jc w:val="left"/>
       </w:pPr>
       <w:r>
@@ -490,7 +490,7 @@
     <w:p>
       <w:pPr>
         <w:spacing w:before="120" w:after="120" w:line="288" w:lineRule="auto"/>
-        <w:ind w:left="453"/>
+        <w:ind w:left="0" w:firstLine="0"/>
         <w:jc w:val="left"/>
       </w:pPr>
       <w:r>
@@ -504,7 +504,7 @@
     <w:p>
       <w:pPr>
         <w:spacing w:before="120" w:after="120" w:line="288" w:lineRule="auto"/>
-        <w:ind w:left="453"/>
+        <w:ind w:left="0" w:firstLine="0"/>
         <w:jc w:val="left"/>
       </w:pPr>
       <w:r>
@@ -545,6 +545,47 @@
           <w:sz w:val="22"/>
         </w:rPr>
         <w:t>显式标识位置示例图</w:t>
+      </w:r>
+    </w:p>
+    <w:p>
+      <w:r>
+        <w:drawing>
+          <wp:inline xmlns:a="http://schemas.openxmlformats.org/drawingml/2006/main" xmlns:pic="http://schemas.openxmlformats.org/drawingml/2006/picture">
+            <wp:extent cx="4320000" cy="5400000"/>
+            <wp:docPr id="2" name="Picture 2"/>
+            <wp:cNvGraphicFramePr>
+              <a:graphicFrameLocks noChangeAspect="1"/>
+            </wp:cNvGraphicFramePr>
+            <a:graphic>
+              <a:graphicData uri="http://schemas.openxmlformats.org/drawingml/2006/picture">
+                <pic:pic>
+                  <pic:nvPicPr>
+                    <pic:cNvPr id="0" name="fig1-ai-story.png"/>
+                    <pic:cNvPicPr/>
+                  </pic:nvPicPr>
+                  <pic:blipFill>
+                    <a:blip r:embed="rId9"/>
+                    <a:stretch>
+                      <a:fillRect/>
+                    </a:stretch>
+                  </pic:blipFill>
+                  <pic:spPr>
+                    <a:xfrm>
+                      <a:off x="0" y="0"/>
+                      <a:ext cx="4320000" cy="5400000"/>
+                    </a:xfrm>
+                    <a:prstGeom prst="rect"/>
+                  </pic:spPr>
+                </pic:pic>
+              </a:graphicData>
+            </a:graphic>
+          </wp:inline>
+        </w:drawing>
+      </w:r>
+    </w:p>
+    <w:p>
+      <w:r>
+        <w:t>图1：AI 单词小短文页面 —— 内容区起始位置显示「AI生成」。</w:t>
       </w:r>
     </w:p>
     <w:p>
@@ -599,7 +640,7 @@
           <w:rFonts w:ascii="Arial" w:hAnsi="Arial" w:eastAsia="等线" w:cs="Arial"/>
           <w:sz w:val="22"/>
         </w:rPr>
-        <w:t>图1：AI 助教回答 —— 回答内容上方显示「AI生成」（AI 单词小短文页使用同一种「AI生成」提示文字）。</w:t>
+        <w:t>图2：AI 助教回答 —— 回答内容上方显示「AI生成」。</w:t>
       </w:r>
     </w:p>
     <w:p>
@@ -817,17 +858,53 @@
       </w:r>
     </w:p>
     <w:p>
-      <w:pPr>
-        <w:spacing w:before="120" w:after="120" w:line="288" w:lineRule="auto"/>
-        <w:ind w:left="453"/>
-        <w:jc w:val="left"/>
-      </w:pPr>
-      <w:r>
-        <w:rPr>
-          <w:rFonts w:ascii="Arial" w:hAnsi="Arial" w:eastAsia="等线" w:cs="Arial"/>
-          <w:sz w:val="22"/>
-        </w:rPr>
-        <w:t>本应用不向用户提供生成合成内容的文件下载或导出功能，不产生图片、音频、视频文件元数据隐式标识，故无隐式标识内容截图。</w:t>
+      <w:r>
+        <w:drawing>
+          <wp:inline xmlns:a="http://schemas.openxmlformats.org/drawingml/2006/main" xmlns:pic="http://schemas.openxmlformats.org/drawingml/2006/picture">
+            <wp:extent cx="4320000" cy="4200000"/>
+            <wp:docPr id="3" name="Picture 3"/>
+            <wp:cNvGraphicFramePr>
+              <a:graphicFrameLocks noChangeAspect="1"/>
+            </wp:cNvGraphicFramePr>
+            <a:graphic>
+              <a:graphicData uri="http://schemas.openxmlformats.org/drawingml/2006/picture">
+                <pic:pic>
+                  <pic:nvPicPr>
+                    <pic:cNvPr id="0" name="fig-copy-paste.png"/>
+                    <pic:cNvPicPr/>
+                  </pic:nvPicPr>
+                  <pic:blipFill>
+                    <a:blip r:embed="rId11"/>
+                    <a:stretch>
+                      <a:fillRect/>
+                    </a:stretch>
+                  </pic:blipFill>
+                  <pic:spPr>
+                    <a:xfrm>
+                      <a:off x="0" y="0"/>
+                      <a:ext cx="4320000" cy="4200000"/>
+                    </a:xfrm>
+                    <a:prstGeom prst="rect"/>
+                  </pic:spPr>
+                </pic:pic>
+              </a:graphicData>
+            </a:graphic>
+          </wp:inline>
+        </w:drawing>
+      </w:r>
+    </w:p>
+    <w:p>
+      <w:pPr>
+        <w:spacing w:before="120" w:after="120" w:line="288" w:lineRule="auto"/>
+        <w:ind w:left="453"/>
+        <w:jc w:val="left"/>
+      </w:pPr>
+      <w:r>
+        <w:rPr>
+          <w:rFonts w:ascii="Arial" w:hAnsi="Arial" w:eastAsia="等线" w:cs="Arial"/>
+          <w:sz w:val="22"/>
+        </w:rPr>
+        <w:t>图3：点击「复制全文」后将内容粘贴至备忘录的截图 —— 首行显示「AI生成」。</w:t>
       </w:r>
     </w:p>
     <w:p>

</xml_diff>